<commit_message>
Add thank you to Kaafihai founders throughout project
- Added "Thank You to Kaafihai" section to README with gratitude to Sahiti, Azan, and Kaustubh
- Added styled thank you section to in-app About page (emerald accent color)
- Updated LAUNCH_NOTE.md with thank you section early in narrative
- Updated Word document (Baajit_Launch_Note.docx) with thank you section
- Acknowledges their vision, patience, and crucial role in bringing Baajit from idea to first cut
- Emphasizes collaborative effort and shared mission for neurodivergent-friendly tools

Co-Authored-By: Claude Haiku 4.5 <noreply@anthropic.com>
</commit_message>
<xml_diff>
--- a/play-store/Baajit_Launch_Note.docx
+++ b/play-store/Baajit_Launch_Note.docx
@@ -75,6 +75,19 @@
     <w:p>
       <w:r>
         <w:t>That’s where the name comes from. And that’s why this app exists.</w:t>
+      </w:r>
+    </w:p>
+    <w:p>
+      <w:pPr>
+        <w:pStyle w:val="Heading2"/>
+      </w:pPr>
+      <w:r>
+        <w:t>Thank You to Kaafihai</w:t>
+      </w:r>
+    </w:p>
+    <w:p>
+      <w:r>
+        <w:t>This app would not exist without the vision and patience of Sahiti, Azan, and Kaustubh at Kaafihai. They listened to my neurodivergent rants, encouraged me to learn to code, and helped shape this idea from clay into a first cut. Without the hard work of all of us, Baajit could not have happened. Thank you for creating space for this, believing in the mission, and building something that matters for neurodivergent minds.</w:t>
       </w:r>
     </w:p>
     <w:p>

</xml_diff>